<commit_message>
Give fact_logins a primary key (username, login_time), with migration 004
</commit_message>
<xml_diff>
--- a/docs/02_Logical_Model.docx
+++ b/docs/02_Logical_Model.docx
@@ -540,7 +540,7 @@
         <w:pStyle w:val="BodyText"/>
       </w:pPr>
       <w:r>
-        <w:t xml:space="preserve">In the real table, day, company and product are stored as keys that point to the dimensions. The numbers are quantity, unit_price (the price paid) and amount = quantity x unit_price. Rows in a fresh build: 2,567.</w:t>
+        <w:t xml:space="preserve">In the real table, day, company and product are stored as keys that point to the dimensions. The numbers are quantity, unit_price (the price paid) and amount = quantity x unit_price. Its key is order_id + line_number: each order line appears once. Rows in a fresh build: 2,567.</w:t>
       </w:r>
     </w:p>
     <w:bookmarkEnd w:id="13"/>
@@ -590,7 +590,7 @@
         <w:pStyle w:val="BodyText"/>
       </w:pPr>
       <w:r>
-        <w:t xml:space="preserve">The number we count is simply the rows (logins). Rows in a fresh build: 2,548.</w:t>
+        <w:t xml:space="preserve">The number we count is simply the rows (logins). Its key is username + login_time: a user cannot start two logins at the same moment, so each login appears once. Rows in a fresh build: 2,548.</w:t>
       </w:r>
     </w:p>
     <w:bookmarkEnd w:id="14"/>

</xml_diff>